<commit_message>
Record final GitHub clone checks and submission documents
</commit_message>
<xml_diff>
--- a/docs/HUONG_DAN_SU_DUNG.docx
+++ b/docs/HUONG_DAN_SU_DUNG.docx
@@ -104,10 +104,7 @@
         <w:jc w:val="center"/>
       </w:pPr>
       <w:r>
-        <w:t xml:space="preserve">Tài liệu dựa trên phiên bản đã nghiệm thu Phase 5, </w:t>
-      </w:r>
-      <w:r>
-        <w:t>tháng 10/2026.</w:t>
+        <w:t>Tài liệu dựa trên phiên bản đã nghiệm thu Phase 5, tháng 10/2026.</w:t>
       </w:r>
     </w:p>
     <w:p>
@@ -142,7 +139,7 @@
       <w:r>
         <w:fldChar w:fldCharType="separate"/>
       </w:r>
-      <w:hyperlink w:anchor="_Toc242225194" w:history="1">
+      <w:hyperlink w:anchor="_Toc242225993" w:history="1">
         <w:r>
           <w:rPr>
             <w:rStyle w:val="Hyperlink"/>
@@ -170,7 +167,7 @@
             <w:noProof/>
             <w:webHidden/>
           </w:rPr>
-          <w:instrText xml:space="preserve"> PAGEREF _Toc242225194 \h </w:instrText>
+          <w:instrText xml:space="preserve"> PAGEREF _Toc242225993 \h </w:instrText>
         </w:r>
         <w:r>
           <w:rPr>
@@ -214,7 +211,7 @@
           <w:sz w:val="22"/>
         </w:rPr>
       </w:pPr>
-      <w:hyperlink w:anchor="_Toc242225195" w:history="1">
+      <w:hyperlink w:anchor="_Toc242225994" w:history="1">
         <w:r>
           <w:rPr>
             <w:rStyle w:val="Hyperlink"/>
@@ -242,7 +239,7 @@
             <w:noProof/>
             <w:webHidden/>
           </w:rPr>
-          <w:instrText xml:space="preserve"> PAGEREF _Toc242225195 \h </w:instrText>
+          <w:instrText xml:space="preserve"> PAGEREF _Toc242225994 \h </w:instrText>
         </w:r>
         <w:r>
           <w:rPr>
@@ -286,7 +283,7 @@
           <w:sz w:val="22"/>
         </w:rPr>
       </w:pPr>
-      <w:hyperlink w:anchor="_Toc242225196" w:history="1">
+      <w:hyperlink w:anchor="_Toc242225995" w:history="1">
         <w:r>
           <w:rPr>
             <w:rStyle w:val="Hyperlink"/>
@@ -314,7 +311,7 @@
             <w:noProof/>
             <w:webHidden/>
           </w:rPr>
-          <w:instrText xml:space="preserve"> PAGEREF _Toc242225196 \h </w:instrText>
+          <w:instrText xml:space="preserve"> PAGEREF _Toc242225995 \h </w:instrText>
         </w:r>
         <w:r>
           <w:rPr>
@@ -358,7 +355,7 @@
           <w:sz w:val="22"/>
         </w:rPr>
       </w:pPr>
-      <w:hyperlink w:anchor="_Toc242225197" w:history="1">
+      <w:hyperlink w:anchor="_Toc242225996" w:history="1">
         <w:r>
           <w:rPr>
             <w:rStyle w:val="Hyperlink"/>
@@ -386,7 +383,7 @@
             <w:noProof/>
             <w:webHidden/>
           </w:rPr>
-          <w:instrText xml:space="preserve"> PAGEREF _Toc242225197 \h </w:instrText>
+          <w:instrText xml:space="preserve"> PAGEREF _Toc242225996 \h </w:instrText>
         </w:r>
         <w:r>
           <w:rPr>
@@ -430,7 +427,7 @@
           <w:sz w:val="22"/>
         </w:rPr>
       </w:pPr>
-      <w:hyperlink w:anchor="_Toc242225198" w:history="1">
+      <w:hyperlink w:anchor="_Toc242225997" w:history="1">
         <w:r>
           <w:rPr>
             <w:rStyle w:val="Hyperlink"/>
@@ -458,7 +455,7 @@
             <w:noProof/>
             <w:webHidden/>
           </w:rPr>
-          <w:instrText xml:space="preserve"> PAGEREF _Toc242225198 \h </w:instrText>
+          <w:instrText xml:space="preserve"> PAGEREF _Toc242225997 \h </w:instrText>
         </w:r>
         <w:r>
           <w:rPr>
@@ -502,7 +499,7 @@
           <w:sz w:val="22"/>
         </w:rPr>
       </w:pPr>
-      <w:hyperlink w:anchor="_Toc242225199" w:history="1">
+      <w:hyperlink w:anchor="_Toc242225998" w:history="1">
         <w:r>
           <w:rPr>
             <w:rStyle w:val="Hyperlink"/>
@@ -530,7 +527,7 @@
             <w:noProof/>
             <w:webHidden/>
           </w:rPr>
-          <w:instrText xml:space="preserve"> PAGEREF _Toc242225199 \h </w:instrText>
+          <w:instrText xml:space="preserve"> PAGEREF _Toc242225998 \h </w:instrText>
         </w:r>
         <w:r>
           <w:rPr>
@@ -574,7 +571,7 @@
           <w:sz w:val="22"/>
         </w:rPr>
       </w:pPr>
-      <w:hyperlink w:anchor="_Toc242225200" w:history="1">
+      <w:hyperlink w:anchor="_Toc242225999" w:history="1">
         <w:r>
           <w:rPr>
             <w:rStyle w:val="Hyperlink"/>
@@ -602,7 +599,7 @@
             <w:noProof/>
             <w:webHidden/>
           </w:rPr>
-          <w:instrText xml:space="preserve"> PAGEREF _Toc242225200 \h </w:instrText>
+          <w:instrText xml:space="preserve"> PAGEREF _Toc242225999 \h </w:instrText>
         </w:r>
         <w:r>
           <w:rPr>
@@ -646,7 +643,7 @@
           <w:sz w:val="22"/>
         </w:rPr>
       </w:pPr>
-      <w:hyperlink w:anchor="_Toc242225201" w:history="1">
+      <w:hyperlink w:anchor="_Toc242226000" w:history="1">
         <w:r>
           <w:rPr>
             <w:rStyle w:val="Hyperlink"/>
@@ -674,7 +671,7 @@
             <w:noProof/>
             <w:webHidden/>
           </w:rPr>
-          <w:instrText xml:space="preserve"> PAGEREF _Toc242225201 \h </w:instrText>
+          <w:instrText xml:space="preserve"> PAGEREF _Toc242226000 \h </w:instrText>
         </w:r>
         <w:r>
           <w:rPr>
@@ -718,7 +715,7 @@
           <w:sz w:val="22"/>
         </w:rPr>
       </w:pPr>
-      <w:hyperlink w:anchor="_Toc242225202" w:history="1">
+      <w:hyperlink w:anchor="_Toc242226001" w:history="1">
         <w:r>
           <w:rPr>
             <w:rStyle w:val="Hyperlink"/>
@@ -746,7 +743,7 @@
             <w:noProof/>
             <w:webHidden/>
           </w:rPr>
-          <w:instrText xml:space="preserve"> PAGEREF _Toc242225202 \h </w:instrText>
+          <w:instrText xml:space="preserve"> PAGEREF _Toc242226001 \h </w:instrText>
         </w:r>
         <w:r>
           <w:rPr>
@@ -790,7 +787,7 @@
           <w:sz w:val="22"/>
         </w:rPr>
       </w:pPr>
-      <w:hyperlink w:anchor="_Toc242225203" w:history="1">
+      <w:hyperlink w:anchor="_Toc242226002" w:history="1">
         <w:r>
           <w:rPr>
             <w:rStyle w:val="Hyperlink"/>
@@ -818,7 +815,7 @@
             <w:noProof/>
             <w:webHidden/>
           </w:rPr>
-          <w:instrText xml:space="preserve"> PAGEREF _Toc242225203 \h </w:instrText>
+          <w:instrText xml:space="preserve"> PAGEREF _Toc242226002 \h </w:instrText>
         </w:r>
         <w:r>
           <w:rPr>
@@ -862,7 +859,7 @@
           <w:sz w:val="22"/>
         </w:rPr>
       </w:pPr>
-      <w:hyperlink w:anchor="_Toc242225204" w:history="1">
+      <w:hyperlink w:anchor="_Toc242226003" w:history="1">
         <w:r>
           <w:rPr>
             <w:rStyle w:val="Hyperlink"/>
@@ -890,7 +887,7 @@
             <w:noProof/>
             <w:webHidden/>
           </w:rPr>
-          <w:instrText xml:space="preserve"> PAGEREF _Toc242225204 \h </w:instrText>
+          <w:instrText xml:space="preserve"> PAGEREF _Toc242226003 \h </w:instrText>
         </w:r>
         <w:r>
           <w:rPr>
@@ -934,7 +931,7 @@
           <w:sz w:val="22"/>
         </w:rPr>
       </w:pPr>
-      <w:hyperlink w:anchor="_Toc242225205" w:history="1">
+      <w:hyperlink w:anchor="_Toc242226004" w:history="1">
         <w:r>
           <w:rPr>
             <w:rStyle w:val="Hyperlink"/>
@@ -962,7 +959,7 @@
             <w:noProof/>
             <w:webHidden/>
           </w:rPr>
-          <w:instrText xml:space="preserve"> PAGEREF _Toc242225205 \h </w:instrText>
+          <w:instrText xml:space="preserve"> PAGEREF _Toc242226004 \h </w:instrText>
         </w:r>
         <w:r>
           <w:rPr>
@@ -1006,7 +1003,7 @@
           <w:sz w:val="22"/>
         </w:rPr>
       </w:pPr>
-      <w:hyperlink w:anchor="_Toc242225206" w:history="1">
+      <w:hyperlink w:anchor="_Toc242226005" w:history="1">
         <w:r>
           <w:rPr>
             <w:rStyle w:val="Hyperlink"/>
@@ -1034,7 +1031,7 @@
             <w:noProof/>
             <w:webHidden/>
           </w:rPr>
-          <w:instrText xml:space="preserve"> PAGEREF _Toc242225206 \h </w:instrText>
+          <w:instrText xml:space="preserve"> PAGEREF _Toc242226005 \h </w:instrText>
         </w:r>
         <w:r>
           <w:rPr>
@@ -1078,7 +1075,7 @@
           <w:sz w:val="22"/>
         </w:rPr>
       </w:pPr>
-      <w:hyperlink w:anchor="_Toc242225207" w:history="1">
+      <w:hyperlink w:anchor="_Toc242226006" w:history="1">
         <w:r>
           <w:rPr>
             <w:rStyle w:val="Hyperlink"/>
@@ -1106,7 +1103,7 @@
             <w:noProof/>
             <w:webHidden/>
           </w:rPr>
-          <w:instrText xml:space="preserve"> PAGEREF _Toc242225207 \h </w:instrText>
+          <w:instrText xml:space="preserve"> PAGEREF _Toc242226006 \h </w:instrText>
         </w:r>
         <w:r>
           <w:rPr>
@@ -1150,7 +1147,7 @@
           <w:sz w:val="22"/>
         </w:rPr>
       </w:pPr>
-      <w:hyperlink w:anchor="_Toc242225208" w:history="1">
+      <w:hyperlink w:anchor="_Toc242226007" w:history="1">
         <w:r>
           <w:rPr>
             <w:rStyle w:val="Hyperlink"/>
@@ -1178,7 +1175,7 @@
             <w:noProof/>
             <w:webHidden/>
           </w:rPr>
-          <w:instrText xml:space="preserve"> PAGEREF _Toc242225208 \h </w:instrText>
+          <w:instrText xml:space="preserve"> PAGEREF _Toc242226007 \h </w:instrText>
         </w:r>
         <w:r>
           <w:rPr>
@@ -1222,7 +1219,7 @@
           <w:sz w:val="22"/>
         </w:rPr>
       </w:pPr>
-      <w:hyperlink w:anchor="_Toc242225209" w:history="1">
+      <w:hyperlink w:anchor="_Toc242226008" w:history="1">
         <w:r>
           <w:rPr>
             <w:rStyle w:val="Hyperlink"/>
@@ -1250,7 +1247,7 @@
             <w:noProof/>
             <w:webHidden/>
           </w:rPr>
-          <w:instrText xml:space="preserve"> PAGEREF _Toc242225209 \h </w:instrText>
+          <w:instrText xml:space="preserve"> PAGEREF _Toc242226008 \h </w:instrText>
         </w:r>
         <w:r>
           <w:rPr>
@@ -1294,7 +1291,7 @@
           <w:sz w:val="22"/>
         </w:rPr>
       </w:pPr>
-      <w:hyperlink w:anchor="_Toc242225210" w:history="1">
+      <w:hyperlink w:anchor="_Toc242226009" w:history="1">
         <w:r>
           <w:rPr>
             <w:rStyle w:val="Hyperlink"/>
@@ -1322,7 +1319,7 @@
             <w:noProof/>
             <w:webHidden/>
           </w:rPr>
-          <w:instrText xml:space="preserve"> PAGEREF _Toc242225210 \h </w:instrText>
+          <w:instrText xml:space="preserve"> PAGEREF _Toc242226009 \h </w:instrText>
         </w:r>
         <w:r>
           <w:rPr>
@@ -1366,7 +1363,7 @@
           <w:sz w:val="22"/>
         </w:rPr>
       </w:pPr>
-      <w:hyperlink w:anchor="_Toc242225211" w:history="1">
+      <w:hyperlink w:anchor="_Toc242226010" w:history="1">
         <w:r>
           <w:rPr>
             <w:rStyle w:val="Hyperlink"/>
@@ -1394,7 +1391,7 @@
             <w:noProof/>
             <w:webHidden/>
           </w:rPr>
-          <w:instrText xml:space="preserve"> PAGEREF _Toc242225211 \h </w:instrText>
+          <w:instrText xml:space="preserve"> PAGEREF _Toc242226010 \h </w:instrText>
         </w:r>
         <w:r>
           <w:rPr>
@@ -1438,7 +1435,7 @@
           <w:sz w:val="22"/>
         </w:rPr>
       </w:pPr>
-      <w:hyperlink w:anchor="_Toc242225212" w:history="1">
+      <w:hyperlink w:anchor="_Toc242226011" w:history="1">
         <w:r>
           <w:rPr>
             <w:rStyle w:val="Hyperlink"/>
@@ -1466,7 +1463,7 @@
             <w:noProof/>
             <w:webHidden/>
           </w:rPr>
-          <w:instrText xml:space="preserve"> PAGEREF _Toc242225212 \h </w:instrText>
+          <w:instrText xml:space="preserve"> PAGEREF _Toc242226011 \h </w:instrText>
         </w:r>
         <w:r>
           <w:rPr>
@@ -1510,7 +1507,7 @@
           <w:sz w:val="22"/>
         </w:rPr>
       </w:pPr>
-      <w:hyperlink w:anchor="_Toc242225213" w:history="1">
+      <w:hyperlink w:anchor="_Toc242226012" w:history="1">
         <w:r>
           <w:rPr>
             <w:rStyle w:val="Hyperlink"/>
@@ -1538,7 +1535,7 @@
             <w:noProof/>
             <w:webHidden/>
           </w:rPr>
-          <w:instrText xml:space="preserve"> PAGEREF _Toc242225213 \h </w:instrText>
+          <w:instrText xml:space="preserve"> PAGEREF _Toc242226012 \h </w:instrText>
         </w:r>
         <w:r>
           <w:rPr>
@@ -1582,7 +1579,7 @@
           <w:sz w:val="22"/>
         </w:rPr>
       </w:pPr>
-      <w:hyperlink w:anchor="_Toc242225214" w:history="1">
+      <w:hyperlink w:anchor="_Toc242226013" w:history="1">
         <w:r>
           <w:rPr>
             <w:rStyle w:val="Hyperlink"/>
@@ -1610,7 +1607,7 @@
             <w:noProof/>
             <w:webHidden/>
           </w:rPr>
-          <w:instrText xml:space="preserve"> PAGEREF _Toc242225214 \h </w:instrText>
+          <w:instrText xml:space="preserve"> PAGEREF _Toc242226013 \h </w:instrText>
         </w:r>
         <w:r>
           <w:rPr>
@@ -1654,7 +1651,7 @@
           <w:sz w:val="22"/>
         </w:rPr>
       </w:pPr>
-      <w:hyperlink w:anchor="_Toc242225215" w:history="1">
+      <w:hyperlink w:anchor="_Toc242226014" w:history="1">
         <w:r>
           <w:rPr>
             <w:rStyle w:val="Hyperlink"/>
@@ -1682,7 +1679,7 @@
             <w:noProof/>
             <w:webHidden/>
           </w:rPr>
-          <w:instrText xml:space="preserve"> PAGEREF _Toc242225215 \h </w:instrText>
+          <w:instrText xml:space="preserve"> PAGEREF _Toc242226014 \h </w:instrText>
         </w:r>
         <w:r>
           <w:rPr>
@@ -1726,7 +1723,7 @@
           <w:sz w:val="22"/>
         </w:rPr>
       </w:pPr>
-      <w:hyperlink w:anchor="_Toc242225216" w:history="1">
+      <w:hyperlink w:anchor="_Toc242226015" w:history="1">
         <w:r>
           <w:rPr>
             <w:rStyle w:val="Hyperlink"/>
@@ -1754,7 +1751,7 @@
             <w:noProof/>
             <w:webHidden/>
           </w:rPr>
-          <w:instrText xml:space="preserve"> PAGEREF _Toc242225216 \h </w:instrText>
+          <w:instrText xml:space="preserve"> PAGEREF _Toc242226015 \h </w:instrText>
         </w:r>
         <w:r>
           <w:rPr>
@@ -1798,7 +1795,7 @@
           <w:sz w:val="22"/>
         </w:rPr>
       </w:pPr>
-      <w:hyperlink w:anchor="_Toc242225217" w:history="1">
+      <w:hyperlink w:anchor="_Toc242226016" w:history="1">
         <w:r>
           <w:rPr>
             <w:rStyle w:val="Hyperlink"/>
@@ -1826,7 +1823,7 @@
             <w:noProof/>
             <w:webHidden/>
           </w:rPr>
-          <w:instrText xml:space="preserve"> PAGEREF _Toc242225217 \h </w:instrText>
+          <w:instrText xml:space="preserve"> PAGEREF _Toc242226016 \h </w:instrText>
         </w:r>
         <w:r>
           <w:rPr>
@@ -1870,7 +1867,7 @@
           <w:sz w:val="22"/>
         </w:rPr>
       </w:pPr>
-      <w:hyperlink w:anchor="_Toc242225218" w:history="1">
+      <w:hyperlink w:anchor="_Toc242226017" w:history="1">
         <w:r>
           <w:rPr>
             <w:rStyle w:val="Hyperlink"/>
@@ -1898,7 +1895,7 @@
             <w:noProof/>
             <w:webHidden/>
           </w:rPr>
-          <w:instrText xml:space="preserve"> PAGEREF _Toc242225218 \h </w:instrText>
+          <w:instrText xml:space="preserve"> PAGEREF _Toc242226017 \h </w:instrText>
         </w:r>
         <w:r>
           <w:rPr>
@@ -1942,7 +1939,7 @@
           <w:sz w:val="22"/>
         </w:rPr>
       </w:pPr>
-      <w:hyperlink w:anchor="_Toc242225219" w:history="1">
+      <w:hyperlink w:anchor="_Toc242226018" w:history="1">
         <w:r>
           <w:rPr>
             <w:rStyle w:val="Hyperlink"/>
@@ -1970,7 +1967,7 @@
             <w:noProof/>
             <w:webHidden/>
           </w:rPr>
-          <w:instrText xml:space="preserve"> PAGEREF _Toc242225219 \h </w:instrText>
+          <w:instrText xml:space="preserve"> PAGEREF _Toc242226018 \h </w:instrText>
         </w:r>
         <w:r>
           <w:rPr>
@@ -2014,7 +2011,7 @@
           <w:sz w:val="22"/>
         </w:rPr>
       </w:pPr>
-      <w:hyperlink w:anchor="_Toc242225220" w:history="1">
+      <w:hyperlink w:anchor="_Toc242226019" w:history="1">
         <w:r>
           <w:rPr>
             <w:rStyle w:val="Hyperlink"/>
@@ -2042,7 +2039,7 @@
             <w:noProof/>
             <w:webHidden/>
           </w:rPr>
-          <w:instrText xml:space="preserve"> PAGEREF _Toc242225220 \h </w:instrText>
+          <w:instrText xml:space="preserve"> PAGEREF _Toc242226019 \h </w:instrText>
         </w:r>
         <w:r>
           <w:rPr>
@@ -2086,7 +2083,7 @@
           <w:sz w:val="22"/>
         </w:rPr>
       </w:pPr>
-      <w:hyperlink w:anchor="_Toc242225221" w:history="1">
+      <w:hyperlink w:anchor="_Toc242226020" w:history="1">
         <w:r>
           <w:rPr>
             <w:rStyle w:val="Hyperlink"/>
@@ -2114,7 +2111,7 @@
             <w:noProof/>
             <w:webHidden/>
           </w:rPr>
-          <w:instrText xml:space="preserve"> PAGEREF _Toc242225221 \h </w:instrText>
+          <w:instrText xml:space="preserve"> PAGEREF _Toc242226020 \h </w:instrText>
         </w:r>
         <w:r>
           <w:rPr>
@@ -2158,7 +2155,7 @@
           <w:sz w:val="22"/>
         </w:rPr>
       </w:pPr>
-      <w:hyperlink w:anchor="_Toc242225222" w:history="1">
+      <w:hyperlink w:anchor="_Toc242226021" w:history="1">
         <w:r>
           <w:rPr>
             <w:rStyle w:val="Hyperlink"/>
@@ -2186,7 +2183,7 @@
             <w:noProof/>
             <w:webHidden/>
           </w:rPr>
-          <w:instrText xml:space="preserve"> PAGEREF _Toc242225222 \h </w:instrText>
+          <w:instrText xml:space="preserve"> PAGEREF _Toc242226021 \h </w:instrText>
         </w:r>
         <w:r>
           <w:rPr>
@@ -2230,7 +2227,7 @@
           <w:sz w:val="22"/>
         </w:rPr>
       </w:pPr>
-      <w:hyperlink w:anchor="_Toc242225223" w:history="1">
+      <w:hyperlink w:anchor="_Toc242226022" w:history="1">
         <w:r>
           <w:rPr>
             <w:rStyle w:val="Hyperlink"/>
@@ -2258,7 +2255,7 @@
             <w:noProof/>
             <w:webHidden/>
           </w:rPr>
-          <w:instrText xml:space="preserve"> PAGEREF _Toc242225223 \h </w:instrText>
+          <w:instrText xml:space="preserve"> PAGEREF _Toc242226022 \h </w:instrText>
         </w:r>
         <w:r>
           <w:rPr>
@@ -2299,7 +2296,7 @@
         <w:pStyle w:val="Heading1"/>
         <w:pageBreakBefore/>
       </w:pPr>
-      <w:bookmarkStart w:id="1" w:name="_Toc242225194"/>
+      <w:bookmarkStart w:id="1" w:name="_Toc242225993"/>
       <w:r>
         <w:lastRenderedPageBreak/>
         <w:t>1. Giới thiệu</w:t>
@@ -2308,17 +2305,14 @@
     </w:p>
     <w:p>
       <w:r>
-        <w:t>Tài liệu hướng dẫn chạy và demo project trên Windows PowerShell. Neo4j là database chính. Các bước cài đặt dùng dữ liệu và script có trong source; ảnh là kết quả thật của phiên bản đã kiểm thử. T</w:t>
-      </w:r>
-      <w:r>
-        <w:t>rước khi nộp, điền các thông tin cá nhân trên trang bìa. Link GitHub sẽ được bổ sung sau audit Phase 7.</w:t>
+        <w:t>Tài liệu hướng dẫn chạy và demo project trên Windows PowerShell. Neo4j là database chính. Các bước cài đặt dùng dữ liệu và script có trong source; ảnh là kết quả thật của phiên bản đã kiểm thử. Trước khi nộp, điền các thông tin cá nhân trên trang bìa. Repository: https://github.com/phi1411/neo4j.</w:t>
       </w:r>
     </w:p>
     <w:p>
       <w:pPr>
         <w:pStyle w:val="Heading1"/>
       </w:pPr>
-      <w:bookmarkStart w:id="2" w:name="_Toc242225195"/>
+      <w:bookmarkStart w:id="2" w:name="_Toc242225994"/>
       <w:r>
         <w:t>2. Yêu cầu môi trường</w:t>
       </w:r>
@@ -2792,17 +2786,14 @@
     </w:tbl>
     <w:p>
       <w:r>
-        <w:t xml:space="preserve">Internet cần cho cài đặt công cụ và thư viện. Demo sử </w:t>
-      </w:r>
-      <w:r>
-        <w:t>dụng Neo4j cục bộ; vis-network đã có trong static. Các phiên bản hoặc hệ điều hành khác chưa được xác nhận bằng báo cáo hiện tại.</w:t>
+        <w:t>Internet cần cho cài đặt công cụ và thư viện. Demo sử dụng Neo4j cục bộ; vis-network đã có trong static. Các phiên bản hoặc hệ điều hành khác chưa được xác nhận bằng báo cáo hiện tại.</w:t>
       </w:r>
     </w:p>
     <w:p>
       <w:pPr>
         <w:pStyle w:val="Heading1"/>
       </w:pPr>
-      <w:bookmarkStart w:id="3" w:name="_Toc242225196"/>
+      <w:bookmarkStart w:id="3" w:name="_Toc242225995"/>
       <w:r>
         <w:t>3. Cấu trúc thư mục</w:t>
       </w:r>
@@ -2834,14 +2825,7 @@
           <w:sz w:val="17"/>
         </w:rPr>
         <w:br/>
-        <w:t xml:space="preserve">  database/            # JSON, schema, seed, qu</w:t>
-      </w:r>
-      <w:r>
-        <w:rPr>
-          <w:rFonts w:ascii="Consolas" w:hAnsi="Consolas"/>
-          <w:sz w:val="17"/>
-        </w:rPr>
-        <w:t>ery, validation</w:t>
+        <w:t xml:space="preserve">  database/            # JSON, schema, seed, query, validation</w:t>
       </w:r>
       <w:r>
         <w:rPr>
@@ -2902,10 +2886,7 @@
     </w:p>
     <w:p>
       <w:r>
-        <w:t>Các lệnh dưới đây chạy từ thư mục gốc project. Kh</w:t>
-      </w:r>
-      <w:r>
-        <w:t>ông đưa .env, .venv hoặc thư mục .qa lên GitHub. Thư mục .qa chứa dữ liệu kiểm tra cục bộ và đã được loại trừ trong .gitignore.</w:t>
+        <w:t>Các lệnh dưới đây chạy từ thư mục gốc project. Không đưa .env, .venv hoặc thư mục .qa lên GitHub. Thư mục .qa chứa dữ liệu kiểm tra cục bộ và đã được loại trừ trong .gitignore.</w:t>
       </w:r>
     </w:p>
     <w:p>
@@ -2913,7 +2894,7 @@
         <w:pStyle w:val="Heading1"/>
         <w:pageBreakBefore/>
       </w:pPr>
-      <w:bookmarkStart w:id="4" w:name="_Toc242225197"/>
+      <w:bookmarkStart w:id="4" w:name="_Toc242225996"/>
       <w:r>
         <w:lastRenderedPageBreak/>
         <w:t>4. Khởi động Neo4j</w:t>
@@ -2922,10 +2903,7 @@
     </w:p>
     <w:p>
       <w:r>
-        <w:t>Cài Neo4j Desktop từ nguồn chính thức. Tạo instance cục bộ, đặt tên tuỳ chọn và tự đặt mật khẩu cho tài khoản</w:t>
-      </w:r>
-      <w:r>
-        <w:t xml:space="preserve"> neo4j. Chọn phiên bản Enterprise có hỗ trợ nhiều database phù hợp giấy phép phát triển. Bấm Start và đợi trạng thái Running trước khi chạy script. Tên instance không phải tên database.</w:t>
+        <w:t>Cài Neo4j Desktop từ nguồn chính thức. Tạo instance cục bộ, đặt tên tuỳ chọn và tự đặt mật khẩu cho tài khoản neo4j. Chọn phiên bản Enterprise có hỗ trợ nhiều database phù hợp giấy phép phát triển. Bấm Start và đợi trạng thái Running trước khi chạy script. Tên instance không phải tên database.</w:t>
       </w:r>
     </w:p>
     <w:p>
@@ -2945,7 +2923,7 @@
       <w:pPr>
         <w:pStyle w:val="Heading1"/>
       </w:pPr>
-      <w:bookmarkStart w:id="5" w:name="_Toc242225198"/>
+      <w:bookmarkStart w:id="5" w:name="_Toc242225997"/>
       <w:r>
         <w:t>5. Tạo/chọn database quadrilateral</w:t>
       </w:r>
@@ -2953,10 +2931,7 @@
     </w:p>
     <w:p>
       <w:r>
-        <w:t>Trong công cụ Query/Browser của instance đang chạy, chọn system bằng bộ chọn database rồi tạo database riêng. Không xóa hoặc dùng lại dữ liệu của database khác. Người dùng cần quyền tạo datab</w:t>
-      </w:r>
-      <w:r>
-        <w:t>ase. Phiên bản đã kiểm thử là Enterprise; không mặc định Community hỗ trợ cấu hình nhiều database này.</w:t>
+        <w:t>Trong công cụ Query/Browser của instance đang chạy, chọn system bằng bộ chọn database rồi tạo database riêng. Không xóa hoặc dùng lại dữ liệu của database khác. Người dùng cần quyền tạo database. Phiên bản đã kiểm thử là Enterprise; không mặc định Community hỗ trợ cấu hình nhiều database này.</w:t>
       </w:r>
     </w:p>
     <w:p>
@@ -2982,17 +2957,14 @@
     </w:p>
     <w:p>
       <w:r>
-        <w:t>Sau khi database quadrilateral online, chọn quadrilateral trước khi chạy query dữ liệu. Bộ c</w:t>
-      </w:r>
-      <w:r>
-        <w:t>họn database phải hiển thị đúng tên. Một instance có thể chứa system, neo4j và quadrilateral cùng lúc.</w:t>
+        <w:t>Sau khi database quadrilateral online, chọn quadrilateral trước khi chạy query dữ liệu. Bộ chọn database phải hiển thị đúng tên. Một instance có thể chứa system, neo4j và quadrilateral cùng lúc.</w:t>
       </w:r>
     </w:p>
     <w:p>
       <w:pPr>
         <w:pStyle w:val="Heading1"/>
       </w:pPr>
-      <w:bookmarkStart w:id="6" w:name="_Toc242225199"/>
+      <w:bookmarkStart w:id="6" w:name="_Toc242225998"/>
       <w:r>
         <w:t>6. Cấu hình .env</w:t>
       </w:r>
@@ -3047,21 +3019,12 @@
           <w:sz w:val="17"/>
         </w:rPr>
         <w:br/>
-      </w:r>
-      <w:r>
-        <w:rPr>
-          <w:rFonts w:ascii="Consolas" w:hAnsi="Consolas"/>
-          <w:sz w:val="17"/>
-        </w:rPr>
         <w:t>NEO4J_DATABASE=quadrilateral</w:t>
       </w:r>
     </w:p>
     <w:p>
       <w:r>
-        <w:t xml:space="preserve">Thay your_password bằng mật khẩu do bạn đặt; không lưu mật khẩu thật vào README hoặc tài liệu. .env nằm ở thư mục gốc, không phải .env.txt. URI không chứa username/password. Flask ưu tiên biến môi trường đã có, còn CLI </w:t>
-      </w:r>
-      <w:r>
-        <w:t>Phase 2 đọc cấu hình từ .env; nếu kết nối khác nhau, kiểm tra biến môi trường trong terminal. Không chọn system làm database ứng dụng.</w:t>
+        <w:t>Thay your_password bằng mật khẩu do bạn đặt; không lưu mật khẩu thật vào README hoặc tài liệu. .env nằm ở thư mục gốc, không phải .env.txt. URI không chứa username/password. Flask ưu tiên biến môi trường đã có, còn CLI Phase 2 đọc cấu hình từ .env; nếu kết nối khác nhau, kiểm tra biến môi trường trong terminal. Không chọn system làm database ứng dụng.</w:t>
       </w:r>
     </w:p>
     <w:p>
@@ -3069,7 +3032,7 @@
         <w:pStyle w:val="Heading1"/>
         <w:pageBreakBefore/>
       </w:pPr>
-      <w:bookmarkStart w:id="7" w:name="_Toc242225200"/>
+      <w:bookmarkStart w:id="7" w:name="_Toc242225999"/>
       <w:r>
         <w:lastRenderedPageBreak/>
         <w:t>7. Cài dependencies</w:t>
@@ -3102,29 +3065,19 @@
           <w:sz w:val="17"/>
         </w:rPr>
         <w:br/>
-        <w:t>.\.venv\Scripts\</w:t>
-      </w:r>
-      <w:r>
-        <w:rPr>
-          <w:rFonts w:ascii="Consolas" w:hAnsi="Consolas"/>
-          <w:sz w:val="17"/>
-        </w:rPr>
-        <w:t>python.exe -m pip check</w:t>
+        <w:t>.\.venv\Scripts\python.exe -m pip check</w:t>
       </w:r>
     </w:p>
     <w:p>
       <w:r>
-        <w:t>Nếu máy chỉ có lệnh python, dùng python -m venv .venv. Những lệnh tiếp theo gọi trực tiếp Python trong môi trường ảo nên không cần kích hoạt môi trường. requirements.txt gồm neo4j, python-dotenv, Flask và pytest với phiên bản cố địn</w:t>
-      </w:r>
-      <w:r>
-        <w:t>h.</w:t>
+        <w:t>Nếu máy chỉ có lệnh python, dùng python -m venv .venv. Những lệnh tiếp theo gọi trực tiếp Python trong môi trường ảo nên không cần kích hoạt môi trường. requirements.txt gồm neo4j, python-dotenv, Flask và pytest với phiên bản cố định.</w:t>
       </w:r>
     </w:p>
     <w:p>
       <w:pPr>
         <w:pStyle w:val="Heading1"/>
       </w:pPr>
-      <w:bookmarkStart w:id="8" w:name="_Toc242225201"/>
+      <w:bookmarkStart w:id="8" w:name="_Toc242226000"/>
       <w:r>
         <w:t>8. Seed dữ liệu</w:t>
       </w:r>
@@ -3153,14 +3106,7 @@
           <w:sz w:val="17"/>
         </w:rPr>
         <w:br/>
-        <w:t>.\.ven</w:t>
-      </w:r>
-      <w:r>
-        <w:rPr>
-          <w:rFonts w:ascii="Consolas" w:hAnsi="Consolas"/>
-          <w:sz w:val="17"/>
-        </w:rPr>
-        <w:t>v\Scripts\python.exe scripts/phase2.py schema</w:t>
+        <w:t>.\.venv\Scripts\python.exe scripts/phase2.py schema</w:t>
       </w:r>
       <w:r>
         <w:rPr>
@@ -3189,20 +3135,14 @@
     </w:p>
     <w:p>
       <w:r>
-        <w:t>Kết quả đúng của dataset hiện tại là 7 Shape, 19 Pro</w:t>
-      </w:r>
-      <w:r>
-        <w:t>perty, 18 Condition: tổng 44 node và 79 relationship. finish kiểm tra, seed lần hai và đối chiếu idempotent rồi lưu báo cáo. Seed lại không tạo dữ liệu trùng. Nếu lệnh báo lỗi, đọc và xử lý nguyên nhân trước khi tiếp tục; không thay database bằng dữ liệu g</w:t>
-      </w:r>
-      <w:r>
-        <w:t>iả để demo.</w:t>
+        <w:t>Kết quả đúng của dataset hiện tại là 7 Shape, 19 Property, 18 Condition: tổng 44 node và 79 relationship. finish kiểm tra, seed lần hai và đối chiếu idempotent rồi lưu báo cáo. Seed lại không tạo dữ liệu trùng. Nếu lệnh báo lỗi, đọc và xử lý nguyên nhân trước khi tiếp tục; không thay database bằng dữ liệu giả để demo.</w:t>
       </w:r>
     </w:p>
     <w:p>
       <w:pPr>
         <w:pStyle w:val="Heading1"/>
       </w:pPr>
-      <w:bookmarkStart w:id="9" w:name="_Toc242225202"/>
+      <w:bookmarkStart w:id="9" w:name="_Toc242226001"/>
       <w:r>
         <w:t>9. Kiểm tra validation</w:t>
       </w:r>
@@ -3223,10 +3163,7 @@
     </w:p>
     <w:p>
       <w:r>
-        <w:t xml:space="preserve">Lệnh kiểm tra 20 validation và 15 query, đối chiếu expected_results.json. Báo cáo nghiệm thu hiện tại là 20/20 validation, 15/15 query PASS. Kết quả verify mới phản ánh </w:t>
-      </w:r>
-      <w:r>
-        <w:t>môi trường tại thời điểm chạy; nên giữ lại các báo cáo lịch sử trước khi ghi đè. Có thể kiểm tra database/validation.cypher trong Neo4j Browser khi đã khai báo tham số.</w:t>
+        <w:t>Lệnh kiểm tra 20 validation và 15 query, đối chiếu expected_results.json. Báo cáo nghiệm thu hiện tại là 20/20 validation, 15/15 query PASS. Kết quả verify mới phản ánh môi trường tại thời điểm chạy; nên giữ lại các báo cáo lịch sử trước khi ghi đè. Có thể kiểm tra database/validation.cypher trong Neo4j Browser khi đã khai báo tham số.</w:t>
       </w:r>
     </w:p>
     <w:p>
@@ -3234,7 +3171,7 @@
         <w:pStyle w:val="Heading1"/>
         <w:pageBreakBefore/>
       </w:pPr>
-      <w:bookmarkStart w:id="10" w:name="_Toc242225203"/>
+      <w:bookmarkStart w:id="10" w:name="_Toc242226002"/>
       <w:r>
         <w:lastRenderedPageBreak/>
         <w:t>10. Chạy Flask</w:t>
@@ -3256,10 +3193,7 @@
     </w:p>
     <w:p>
       <w:r>
-        <w:t>Giữ cửa sổ terminal này mở. Server chạ</w:t>
-      </w:r>
-      <w:r>
-        <w:t>y tại 127.0.0.1:5000, debug và reloader tắt. Nếu port 5000 đang dùng, chọn port khác và truy cập đúng port đó:</w:t>
+        <w:t>Giữ cửa sổ terminal này mở. Server chạy tại 127.0.0.1:5000, debug và reloader tắt. Nếu port 5000 đang dùng, chọn port khác và truy cập đúng port đó:</w:t>
       </w:r>
     </w:p>
     <w:p>
@@ -3279,7 +3213,7 @@
       <w:pPr>
         <w:pStyle w:val="Heading1"/>
       </w:pPr>
-      <w:bookmarkStart w:id="11" w:name="_Toc242225204"/>
+      <w:bookmarkStart w:id="11" w:name="_Toc242226003"/>
       <w:r>
         <w:t>11. Truy cập website</w:t>
       </w:r>
@@ -3300,18 +3234,12 @@
     </w:p>
     <w:p>
       <w:r>
-        <w:t>Mở địa chỉ trên</w:t>
-      </w:r>
-      <w:r>
-        <w:t xml:space="preserve"> bằng trình duyệt. Navbar dẫn tới Tổng quan, Tứ giác, Graph, Truy vấn và Giới thiệu. Kiểm tra trạng thái kết nối Neo4j và số liệu dashboard trước khi bắt đầu thuyết trình.</w:t>
+        <w:t>Mở địa chỉ trên bằng trình duyệt. Navbar dẫn tới Tổng quan, Tứ giác, Graph, Truy vấn và Giới thiệu. Kiểm tra trạng thái kết nối Neo4j và số liệu dashboard trước khi bắt đầu thuyết trình.</w:t>
       </w:r>
     </w:p>
     <w:p>
       <w:r>
-        <w:t>Luồng demo gợi ý: Tổng quan → taxonomy → tìm hinh vuong → chi tiết Hình vuông → Prop</w:t>
-      </w:r>
-      <w:r>
-        <w:t>erty kế thừa → Condition → Q06, Q09, Q15 → đối chiếu Neo4j Browser. Dùng graph để giải thích quan hệ, không chỉ đọc các card thống kê.</w:t>
+        <w:t>Luồng demo gợi ý: Tổng quan → taxonomy → tìm hinh vuong → chi tiết Hình vuông → Property kế thừa → Condition → Q06, Q09, Q15 → đối chiếu Neo4j Browser. Dùng graph để giải thích quan hệ, không chỉ đọc các card thống kê.</w:t>
       </w:r>
     </w:p>
     <w:p>
@@ -3319,7 +3247,7 @@
         <w:pStyle w:val="Heading1"/>
         <w:pageBreakBefore/>
       </w:pPr>
-      <w:bookmarkStart w:id="12" w:name="_Toc242225205"/>
+      <w:bookmarkStart w:id="12" w:name="_Toc242226004"/>
       <w:r>
         <w:lastRenderedPageBreak/>
         <w:t>12. Trang Tổng quan</w:t>
@@ -3328,10 +3256,7 @@
     </w:p>
     <w:p>
       <w:r>
-        <w:t>Mở /. Đọc các card node, relationship và số loại hình; kết quả đúng là 44, 79 và 7. Xem graph tổng qu</w:t>
-      </w:r>
-      <w:r>
-        <w:t>an rồi chọn node để đọc thông tin. Các thống kê chỉ thuộc dataset quadrilateral-v1.</w:t>
+        <w:t>Mở /. Đọc các card node, relationship và số loại hình; kết quả đúng là 44, 79 và 7. Xem graph tổng quan rồi chọn node để đọc thông tin. Các thống kê chỉ thuộc dataset quadrilateral-v1.</w:t>
       </w:r>
     </w:p>
     <w:p>
@@ -3394,7 +3319,7 @@
         <w:pStyle w:val="Heading1"/>
         <w:pageBreakBefore/>
       </w:pPr>
-      <w:bookmarkStart w:id="13" w:name="_Toc242225206"/>
+      <w:bookmarkStart w:id="13" w:name="_Toc242226005"/>
       <w:r>
         <w:lastRenderedPageBreak/>
         <w:t>13. Danh sách tứ giác</w:t>
@@ -3403,10 +3328,7 @@
     </w:p>
     <w:p>
       <w:r>
-        <w:t>Mở /shapes. Trang hiển thị bảy loại hình với định nghĩa và lối mở chi tiết. Đối chiếu tên Hình th</w:t>
-      </w:r>
-      <w:r>
-        <w:t>ang và Hình bình hành với hai nhánh riêng của taxonomy.</w:t>
+        <w:t>Mở /shapes. Trang hiển thị bảy loại hình với định nghĩa và lối mở chi tiết. Đối chiếu tên Hình thang và Hình bình hành với hai nhánh riêng của taxonomy.</w:t>
       </w:r>
     </w:p>
     <w:p>
@@ -3469,7 +3391,7 @@
         <w:pStyle w:val="Heading1"/>
         <w:pageBreakBefore/>
       </w:pPr>
-      <w:bookmarkStart w:id="14" w:name="_Toc242225207"/>
+      <w:bookmarkStart w:id="14" w:name="_Toc242226006"/>
       <w:r>
         <w:lastRenderedPageBreak/>
         <w:t>14. Tìm kiếm</w:t>
@@ -3478,10 +3400,7 @@
     </w:p>
     <w:p>
       <w:r>
-        <w:t xml:space="preserve">Trên /shapes, nhập hinh vuong vào ô tìm kiếm. Kết quả là Hình vuông (HV). Thử Hình vuông để kiểm tra tìm kiếm có dấu; xoá nội dung để trở lại bảy </w:t>
-      </w:r>
-      <w:r>
-        <w:t>hình. Không có kết quả thì trang thông báo rõ, không giữ kết quả của lần tìm trước.</w:t>
+        <w:t>Trên /shapes, nhập hinh vuong vào ô tìm kiếm. Kết quả là Hình vuông (HV). Thử Hình vuông để kiểm tra tìm kiếm có dấu; xoá nội dung để trở lại bảy hình. Không có kết quả thì trang thông báo rõ, không giữ kết quả của lần tìm trước.</w:t>
       </w:r>
     </w:p>
     <w:p>
@@ -3544,7 +3463,7 @@
         <w:pStyle w:val="Heading1"/>
         <w:pageBreakBefore/>
       </w:pPr>
-      <w:bookmarkStart w:id="15" w:name="_Toc242225208"/>
+      <w:bookmarkStart w:id="15" w:name="_Toc242226007"/>
       <w:r>
         <w:lastRenderedPageBreak/>
         <w:t>15. Chi tiết Hình vuông</w:t>
@@ -3553,10 +3472,7 @@
     </w:p>
     <w:p>
       <w:r>
-        <w:t>Chọn Hình vuông hoặc mở /shapes/HV. Đọc định nghĩa, hai lớp cha Hình chữ nhật và Hình t</w:t>
-      </w:r>
-      <w:r>
-        <w:t>hoi, rồi xem các tổ tiên. HV có HBH, HCN, HTHOI, TQ là tổ tiên; không có HT hoặc HTC.</w:t>
+        <w:t>Chọn Hình vuông hoặc mở /shapes/HV. Đọc định nghĩa, hai lớp cha Hình chữ nhật và Hình thoi, rồi xem các tổ tiên. HV có HBH, HCN, HTHOI, TQ là tổ tiên; không có HT hoặc HTC.</w:t>
       </w:r>
     </w:p>
     <w:p>
@@ -3619,7 +3535,7 @@
         <w:pStyle w:val="Heading1"/>
         <w:pageBreakBefore/>
       </w:pPr>
-      <w:bookmarkStart w:id="16" w:name="_Toc242225209"/>
+      <w:bookmarkStart w:id="16" w:name="_Toc242226008"/>
       <w:r>
         <w:lastRenderedPageBreak/>
         <w:t>16. Xem Property kế thừa</w:t>
@@ -3628,10 +3544,7 @@
     </w:p>
     <w:p>
       <w:r>
-        <w:t>Cuộn tới phần tính chất. HV có 12 tính chất hiệu lực dù không có HAS_PROPERTY trực tiếp</w:t>
-      </w:r>
-      <w:r>
-        <w:t>. Đọc nguồn khai báo ở các lớp cha/tổ tiên. Đây là phần cần giải thích khi giảng viên hỏi vì sao dùng graph.</w:t>
+        <w:t>Cuộn tới phần tính chất. HV có 12 tính chất hiệu lực dù không có HAS_PROPERTY trực tiếp. Đọc nguồn khai báo ở các lớp cha/tổ tiên. Đây là phần cần giải thích khi giảng viên hỏi vì sao dùng graph.</w:t>
       </w:r>
     </w:p>
     <w:p>
@@ -3694,7 +3607,7 @@
         <w:pStyle w:val="Heading1"/>
         <w:pageBreakBefore/>
       </w:pPr>
-      <w:bookmarkStart w:id="17" w:name="_Toc242225210"/>
+      <w:bookmarkStart w:id="17" w:name="_Toc242226009"/>
       <w:r>
         <w:lastRenderedPageBreak/>
         <w:t>17. Xem Condition</w:t>
@@ -3703,10 +3616,7 @@
     </w:p>
     <w:p>
       <w:r>
-        <w:t>Đọc năm cách nhận biết Hình vuông. Trong mỗi Condition, ngữ cảnh và</w:t>
-      </w:r>
-      <w:r>
-        <w:t xml:space="preserve"> các giả thiết nối bằng AND; năm Condition là các lựa chọn OR. Ví dụ C_HV_05 cần Tứ giác, bốn cạnh bằng nhau và bốn góc vuông đồng thời. Ứng dụng trình bày tri thức, chưa tự phân loại hình từ đầu vào.</w:t>
+        <w:t>Đọc năm cách nhận biết Hình vuông. Trong mỗi Condition, ngữ cảnh và các giả thiết nối bằng AND; năm Condition là các lựa chọn OR. Ví dụ C_HV_05 cần Tứ giác, bốn cạnh bằng nhau và bốn góc vuông đồng thời. Ứng dụng trình bày tri thức, chưa tự phân loại hình từ đầu vào.</w:t>
       </w:r>
     </w:p>
     <w:p>
@@ -3769,13 +3679,10 @@
         <w:pStyle w:val="Heading1"/>
         <w:pageBreakBefore/>
       </w:pPr>
-      <w:bookmarkStart w:id="18" w:name="_Toc242225211"/>
+      <w:bookmarkStart w:id="18" w:name="_Toc242226010"/>
       <w:r>
         <w:lastRenderedPageBreak/>
-        <w:t xml:space="preserve">18. </w:t>
-      </w:r>
-      <w:r>
-        <w:t>Graph taxonomy</w:t>
+        <w:t>18. Graph taxonomy</w:t>
       </w:r>
       <w:bookmarkEnd w:id="18"/>
     </w:p>
@@ -3844,22 +3751,16 @@
         <w:pStyle w:val="Heading1"/>
         <w:pageBreakBefore/>
       </w:pPr>
-      <w:bookmarkStart w:id="19" w:name="_Toc242225212"/>
+      <w:bookmarkStart w:id="19" w:name="_Toc242226011"/>
       <w:r>
         <w:lastRenderedPageBreak/>
-        <w:t>19.</w:t>
-      </w:r>
-      <w:r>
-        <w:t xml:space="preserve"> Graph neighborhood</w:t>
+        <w:t>19. Graph neighborhood</w:t>
       </w:r>
       <w:bookmarkEnd w:id="19"/>
     </w:p>
     <w:p>
       <w:r>
-        <w:t>Chọn graph lân cận, chọn Hình vuông và độ sâu 1. Kết quả là 8 node/11 cạnh. Tăng lên 2 để được 23/43, và lên 3 để được 39/71. Node gồm Shape, Property, Condition; graph lấy các cạnh giữa node được chọn, không chỉ các cạnh trên một đường</w:t>
-      </w:r>
-      <w:r>
-        <w:t xml:space="preserve"> duyệt.</w:t>
+        <w:t>Chọn graph lân cận, chọn Hình vuông và độ sâu 1. Kết quả là 8 node/11 cạnh. Tăng lên 2 để được 23/43, và lên 3 để được 39/71. Node gồm Shape, Property, Condition; graph lấy các cạnh giữa node được chọn, không chỉ các cạnh trên một đường duyệt.</w:t>
       </w:r>
     </w:p>
     <w:p>
@@ -3922,7 +3823,7 @@
         <w:pStyle w:val="Heading2"/>
         <w:pageBreakBefore/>
       </w:pPr>
-      <w:bookmarkStart w:id="20" w:name="_Toc242225213"/>
+      <w:bookmarkStart w:id="20" w:name="_Toc242226012"/>
       <w:r>
         <w:lastRenderedPageBreak/>
         <w:t>19.1 Tăng độ sâu và đọc quan hệ</w:t>
@@ -3986,10 +3887,7 @@
     </w:p>
     <w:p>
       <w:r>
-        <w:t xml:space="preserve">Số node/cạnh tăng do graph mở rộng qua các loại relationship theo cả hai hướng. Chọn từng cạnh để đọc nhãn; không suy ra </w:t>
-      </w:r>
-      <w:r>
-        <w:t>quan hệ IS_A chỉ vì hai node gần nhau trong bố cục. Nút căn graph đưa tất cả node vào khung xem.</w:t>
+        <w:t>Số node/cạnh tăng do graph mở rộng qua các loại relationship theo cả hai hướng. Chọn từng cạnh để đọc nhãn; không suy ra quan hệ IS_A chỉ vì hai node gần nhau trong bố cục. Nút căn graph đưa tất cả node vào khung xem.</w:t>
       </w:r>
     </w:p>
     <w:p>
@@ -3997,7 +3895,7 @@
         <w:pStyle w:val="Heading1"/>
         <w:pageBreakBefore/>
       </w:pPr>
-      <w:bookmarkStart w:id="21" w:name="_Toc242225214"/>
+      <w:bookmarkStart w:id="21" w:name="_Toc242226013"/>
       <w:r>
         <w:lastRenderedPageBreak/>
         <w:t>20. Truy vấn demo</w:t>
@@ -4006,10 +3904,7 @@
     </w:p>
     <w:p>
       <w:r>
-        <w:t xml:space="preserve">Mở /queries. Chọn query, xem Cypher và tham số rồi thực thi. Q06 trả Hình thoi và Hình vuông; Q09 trả hai đường đi TQ–HV; Q15 giải thích một </w:t>
-      </w:r>
-      <w:r>
-        <w:t>tính chất qua hai nhánh kế thừa. Chỉ có query trong danh mục được chạy, không có ô thực thi Cypher tuỳ ý.</w:t>
+        <w:t>Mở /queries. Chọn query, xem Cypher và tham số rồi thực thi. Q06 trả Hình thoi và Hình vuông; Q09 trả hai đường đi TQ–HV; Q15 giải thích một tính chất qua hai nhánh kế thừa. Chỉ có query trong danh mục được chạy, không có ô thực thi Cypher tuỳ ý.</w:t>
       </w:r>
     </w:p>
     <w:p>
@@ -4072,7 +3967,7 @@
         <w:pStyle w:val="Heading2"/>
         <w:pageBreakBefore/>
       </w:pPr>
-      <w:bookmarkStart w:id="22" w:name="_Toc242225215"/>
+      <w:bookmarkStart w:id="22" w:name="_Toc242226014"/>
       <w:r>
         <w:lastRenderedPageBreak/>
         <w:t>20.1 Đọc đường đi giải thích Q15</w:t>
@@ -4136,10 +4031,7 @@
     </w:p>
     <w:p>
       <w:r>
-        <w:t>Đọc mỗi đườn</w:t>
-      </w:r>
-      <w:r>
-        <w:t>g: HV → HCN/HTHOI → HBH → Property Đường chéo chia đôi nhau. Các cạnh trước là IS_A; cạnh cuối là HAS_PROPERTY. Kết quả trùng Property được giữ ở dạng đường đi vì hai đường là hai chứng cứ về kế thừa.</w:t>
+        <w:t>Đọc mỗi đường: HV → HCN/HTHOI → HBH → Property Đường chéo chia đôi nhau. Các cạnh trước là IS_A; cạnh cuối là HAS_PROPERTY. Kết quả trùng Property được giữ ở dạng đường đi vì hai đường là hai chứng cứ về kế thừa.</w:t>
       </w:r>
     </w:p>
     <w:p>
@@ -4147,7 +4039,7 @@
         <w:pStyle w:val="Heading1"/>
         <w:pageBreakBefore/>
       </w:pPr>
-      <w:bookmarkStart w:id="23" w:name="_Toc242225216"/>
+      <w:bookmarkStart w:id="23" w:name="_Toc242226015"/>
       <w:r>
         <w:lastRenderedPageBreak/>
         <w:t>21. Neo4j Query/Browser</w:t>
@@ -4156,10 +4048,7 @@
     </w:p>
     <w:p>
       <w:r>
-        <w:t>Mở Query/Browser của instance t</w:t>
-      </w:r>
-      <w:r>
-        <w:t>rong Neo4j Desktop. Chọn database quadrilateral. Khai báo tham số bằng lệnh ở mục 22, sau đó copy query từ database/demo_queries.cypher. Dùng Table để đối chiếu giá trị hoặc Graph khi kết quả có node/relationship/path.</w:t>
+        <w:t>Mở Query/Browser của instance trong Neo4j Desktop. Chọn database quadrilateral. Khai báo tham số bằng lệnh ở mục 22, sau đó copy query từ database/demo_queries.cypher. Dùng Table để đối chiếu giá trị hoặc Graph khi kết quả có node/relationship/path.</w:t>
       </w:r>
     </w:p>
     <w:p>
@@ -4214,10 +4103,7 @@
         <w:jc w:val="center"/>
       </w:pPr>
       <w:r>
-        <w:t>Hình 12. Đối chiếu truy vấn bốn cạn</w:t>
-      </w:r>
-      <w:r>
-        <w:t>h bằng nhau trực tiếp trên Neo4j.</w:t>
+        <w:t>Hình 12. Đối chiếu truy vấn bốn cạnh bằng nhau trực tiếp trên Neo4j.</w:t>
       </w:r>
     </w:p>
     <w:p>
@@ -4225,7 +4111,7 @@
         <w:pStyle w:val="Heading2"/>
         <w:pageBreakBefore/>
       </w:pPr>
-      <w:bookmarkStart w:id="24" w:name="_Toc242225217"/>
+      <w:bookmarkStart w:id="24" w:name="_Toc242226016"/>
       <w:r>
         <w:lastRenderedPageBreak/>
         <w:t>21.1 Xem graph trên Neo4j</w:t>
@@ -4289,10 +4175,7 @@
     </w:p>
     <w:p>
       <w:r>
-        <w:t xml:space="preserve">Ảnh Browser chụp ở cửa sổ hẹp nên nhãn có thể nhỏ. Dùng graph taxonomy của ứng dụng để đọc tên rõ hơn; Browser dùng để chứng minh dữ liệu </w:t>
-      </w:r>
-      <w:r>
-        <w:t>node/relationship được truy vấn trực tiếp từ Neo4j.</w:t>
+        <w:t>Ảnh Browser chụp ở cửa sổ hẹp nên nhãn có thể nhỏ. Dùng graph taxonomy của ứng dụng để đọc tên rõ hơn; Browser dùng để chứng minh dữ liệu node/relationship được truy vấn trực tiếp từ Neo4j.</w:t>
       </w:r>
     </w:p>
     <w:p>
@@ -4300,7 +4183,7 @@
         <w:pStyle w:val="Heading1"/>
         <w:pageBreakBefore/>
       </w:pPr>
-      <w:bookmarkStart w:id="25" w:name="_Toc242225218"/>
+      <w:bookmarkStart w:id="25" w:name="_Toc242226017"/>
       <w:r>
         <w:lastRenderedPageBreak/>
         <w:t>22. Một số Cypher mẫu</w:t>
@@ -4329,7 +4212,7 @@
       <w:pPr>
         <w:pStyle w:val="Heading2"/>
       </w:pPr>
-      <w:bookmarkStart w:id="26" w:name="_Toc242225219"/>
+      <w:bookmarkStart w:id="26" w:name="_Toc242226018"/>
       <w:r>
         <w:t>Q03 — Cha trực tiếp của HV</w:t>
       </w:r>
@@ -4345,14 +4228,7 @@
           <w:rFonts w:ascii="Consolas" w:hAnsi="Consolas"/>
           <w:sz w:val="17"/>
         </w:rPr>
-        <w:t>MAT</w:t>
-      </w:r>
-      <w:r>
-        <w:rPr>
-          <w:rFonts w:ascii="Consolas" w:hAnsi="Consolas"/>
-          <w:sz w:val="17"/>
-        </w:rPr>
-        <w:t>CH (:Shape:ProjectEntity {dataset: $dataset, id:</w:t>
+        <w:t>MATCH (:Shape:ProjectEntity {dataset: $dataset, id:</w:t>
       </w:r>
       <w:r>
         <w:rPr>
@@ -4380,12 +4256,9 @@
       <w:pPr>
         <w:pStyle w:val="Heading2"/>
       </w:pPr>
-      <w:bookmarkStart w:id="27" w:name="_Toc242225220"/>
+      <w:bookmarkStart w:id="27" w:name="_Toc242226019"/>
       <w:r>
-        <w:t>Q06 — Bốn cạnh bằn</w:t>
-      </w:r>
-      <w:r>
-        <w:t>g nhau</w:t>
+        <w:t>Q06 — Bốn cạnh bằng nhau</w:t>
       </w:r>
       <w:bookmarkEnd w:id="27"/>
     </w:p>
@@ -4423,14 +4296,7 @@
           <w:sz w:val="17"/>
         </w:rPr>
         <w:br/>
-        <w:t>WHERE all(n IN nodes(path) WHERE n.dataset = $dataset AND n:ProjectEn</w:t>
-      </w:r>
-      <w:r>
-        <w:rPr>
-          <w:rFonts w:ascii="Consolas" w:hAnsi="Consolas"/>
-          <w:sz w:val="17"/>
-        </w:rPr>
-        <w:t>tity)</w:t>
+        <w:t>WHERE all(n IN nodes(path) WHERE n.dataset = $dataset AND n:ProjectEntity)</w:t>
       </w:r>
       <w:r>
         <w:rPr>
@@ -4450,7 +4316,7 @@
       <w:pPr>
         <w:pStyle w:val="Heading2"/>
       </w:pPr>
-      <w:bookmarkStart w:id="28" w:name="_Toc242225221"/>
+      <w:bookmarkStart w:id="28" w:name="_Toc242226020"/>
       <w:r>
         <w:t>Q09 — Đường đi TQ – HV</w:t>
       </w:r>
@@ -4474,12 +4340,6 @@
           <w:sz w:val="17"/>
         </w:rPr>
         <w:br/>
-      </w:r>
-      <w:r>
-        <w:rPr>
-          <w:rFonts w:ascii="Consolas" w:hAnsi="Consolas"/>
-          <w:sz w:val="17"/>
-        </w:rPr>
         <w:t xml:space="preserve">  'TQ'})&lt;-[:IS_A*1..6]-(:Shape:ProjectEntity {dataset: $dataset, id: $shape_id})</w:t>
       </w:r>
       <w:r>
@@ -4509,10 +4369,7 @@
     </w:p>
     <w:p>
       <w:r>
-        <w:t>Kế</w:t>
-      </w:r>
-      <w:r>
-        <w:t>t quả đã kiểm thử: 2 đường đi, mỗi đường dài 3 cạnh.</w:t>
+        <w:t>Kết quả đã kiểm thử: 2 đường đi, mỗi đường dài 3 cạnh.</w:t>
       </w:r>
     </w:p>
     <w:p>
@@ -4525,29 +4382,23 @@
         <w:pStyle w:val="Heading1"/>
         <w:pageBreakBefore/>
       </w:pPr>
-      <w:bookmarkStart w:id="29" w:name="_Toc242225222"/>
+      <w:bookmarkStart w:id="29" w:name="_Toc242226021"/>
       <w:r>
         <w:lastRenderedPageBreak/>
-        <w:t>23</w:t>
-      </w:r>
-      <w:r>
-        <w:t>. Dừng ứng dụng</w:t>
+        <w:t>23. Dừng ứng dụng</w:t>
       </w:r>
       <w:bookmarkEnd w:id="29"/>
     </w:p>
     <w:p>
       <w:r>
-        <w:t>Trong terminal đang chạy Flask, nhấn Ctrl+C và đợi server thoát. Đóng tab web khi không cần demo. Nếu muốn dừng Neo4j, dùng Stop trong Neo4j Desktop sau khi các lệnh đang chạy đã kết thúc. Không chọn Delete instance/database để dừng dịch vụ</w:t>
-      </w:r>
-      <w:r>
-        <w:t>.</w:t>
+        <w:t>Trong terminal đang chạy Flask, nhấn Ctrl+C và đợi server thoát. Đóng tab web khi không cần demo. Nếu muốn dừng Neo4j, dùng Stop trong Neo4j Desktop sau khi các lệnh đang chạy đã kết thúc. Không chọn Delete instance/database để dừng dịch vụ.</w:t>
       </w:r>
     </w:p>
     <w:p>
       <w:pPr>
         <w:pStyle w:val="Heading1"/>
       </w:pPr>
-      <w:bookmarkStart w:id="30" w:name="_Toc242225223"/>
+      <w:bookmarkStart w:id="30" w:name="_Toc242226022"/>
       <w:r>
         <w:t>24. Xử lý lỗi thường gặp</w:t>
       </w:r>
@@ -4761,13 +4612,7 @@
               <w:rPr>
                 <w:sz w:val="21"/>
               </w:rPr>
-              <w:t xml:space="preserve">Kiểm tra </w:t>
-            </w:r>
-            <w:r>
-              <w:rPr>
-                <w:sz w:val="21"/>
-              </w:rPr>
-              <w:t>username/password trong .env, dùng mật khẩu đã đặt cho instance; không gửi mật khẩu vào báo cáo hoặc ảnh.</w:t>
+              <w:t>Kiểm tra username/password trong .env, dùng mật khẩu đã đặt cho instance; không gửi mật khẩu vào báo cáo hoặc ảnh.</w:t>
             </w:r>
           </w:p>
         </w:tc>
@@ -4864,13 +4709,7 @@
               <w:rPr>
                 <w:sz w:val="21"/>
               </w:rPr>
-              <w:t>Không truy cập Bolt port 76</w:t>
-            </w:r>
-            <w:r>
-              <w:rPr>
-                <w:sz w:val="21"/>
-              </w:rPr>
-              <w:t>87</w:t>
+              <w:t>Không truy cập Bolt port 7687</w:t>
             </w:r>
           </w:p>
         </w:tc>
@@ -4996,13 +4835,7 @@
               <w:rPr>
                 <w:sz w:val="21"/>
               </w:rPr>
-              <w:t>Thiếu package /</w:t>
-            </w:r>
-            <w:r>
-              <w:rPr>
-                <w:sz w:val="21"/>
-              </w:rPr>
-              <w:t xml:space="preserve"> ModuleNotFoundError</w:t>
+              <w:t>Thiếu package / ModuleNotFoundError</w:t>
             </w:r>
           </w:p>
         </w:tc>
@@ -5157,13 +4990,7 @@
               <w:rPr>
                 <w:sz w:val="21"/>
               </w:rPr>
-              <w:t>Chọn quadrilater</w:t>
-            </w:r>
-            <w:r>
-              <w:rPr>
-                <w:sz w:val="21"/>
-              </w:rPr>
-              <w:t>al và chạy :params ở mục 22 trước khi copy Cypher trong Browser.</w:t>
+              <w:t>Chọn quadrilateral và chạy :params ở mục 22 trước khi copy Cypher trong Browser.</w:t>
             </w:r>
           </w:p>
         </w:tc>
@@ -5171,10 +4998,7 @@
     </w:tbl>
     <w:p>
       <w:r>
-        <w:t xml:space="preserve">Sau khi sửa cấu hình, khởi động lại Flask để nạp cấu hình mới. Không bỏ qua lỗi validation hoặc thay expected result để làm test PASS. Nếu chưa rõ nguyên nhân, giữ nguyên dữ liệu và xem </w:t>
-      </w:r>
-      <w:r>
-        <w:t>báo cáo kiểm thử/README trước khi sửa schema.</w:t>
+        <w:t>Sau khi sửa cấu hình, khởi động lại Flask để nạp cấu hình mới. Không bỏ qua lỗi validation hoặc thay expected result để làm test PASS. Nếu chưa rõ nguyên nhân, giữ nguyên dữ liệu và xem báo cáo kiểm thử/README trước khi sửa schema.</w:t>
       </w:r>
     </w:p>
     <w:sectPr>
@@ -5779,10 +5603,6 @@
     <w:lsdException w:name="Book Title" w:uiPriority="33" w:qFormat="1"/>
     <w:lsdException w:name="Bibliography" w:semiHidden="1" w:uiPriority="37" w:unhideWhenUsed="1"/>
     <w:lsdException w:name="TOC Heading" w:semiHidden="1" w:uiPriority="39" w:unhideWhenUsed="1" w:qFormat="1"/>
-    <w:lsdException w:name="Grid Table Light" w:semiHidden="1" w:unhideWhenUsed="1"/>
-    <w:lsdException w:name="Grid Table 1 Light" w:semiHidden="1" w:unhideWhenUsed="1"/>
-    <w:lsdException w:name="Grid Table 2" w:semiHidden="1" w:unhideWhenUsed="1"/>
-    <w:lsdException w:name="Grid Table 3" w:semiHidden="1" w:unhideWhenUsed="1"/>
     <w:lsdException w:name="Grid Table 4" w:uiPriority="49"/>
     <w:lsdException w:name="Grid Table 5 Dark" w:uiPriority="50"/>
     <w:lsdException w:name="Grid Table 6 Colorful" w:uiPriority="51"/>
@@ -17251,7 +17071,7 @@
 </file>
 
 <file path=customXml/itemProps1.xml><?xml version="1.0" encoding="utf-8"?>
-<ds:datastoreItem xmlns:ds="http://schemas.openxmlformats.org/officeDocument/2006/customXml" ds:itemID="{54287F51-1999-4D08-9345-C7330B7613B9}">
+<ds:datastoreItem xmlns:ds="http://schemas.openxmlformats.org/officeDocument/2006/customXml" ds:itemID="{46164386-586A-436F-89AF-14E8F776C416}">
   <ds:schemaRefs>
     <ds:schemaRef ds:uri="http://schemas.openxmlformats.org/officeDocument/2006/bibliography"/>
   </ds:schemaRefs>

</xml_diff>